<commit_message>
Précise la règle des 12 jours consécutifs et le barème conventionnel
Co-Authored-By: Claude Sonnet 5.5 <noreply@anthropic.com>
Claude-Session: https://claude.ai/code/session_01HJAh9TQga6fZztnqnhABbG
</commit_message>
<xml_diff>
--- a/Circulaire_les_jours_de_conges_de_fractionnement.docx
+++ b/Circulaire_les_jours_de_conges_de_fractionnement.docx
@@ -191,7 +191,7 @@
         <w:t xml:space="preserve">Période légale de prise :</w:t>
       </w:r>
       <w:r>
-        <w:t xml:space="preserve"> du 1er mai au 31 octobre (article 33). Au moins 12 jours ouvrables consécutifs du congé principal sont pris pendant cette période.</w:t>
+        <w:t xml:space="preserve"> du 1er mai au 31 octobre (article 33). Au moins 12 jours ouvrables consécutifs du congé principal, d'un seul bloc et sans interruption, doivent être pris pendant cette période. Il reste donc au plus 12 jours du congé principal à prendre à partir du 1er novembre.</w:t>
       </w:r>
     </w:p>
     <w:p>
@@ -1574,6 +1574,30 @@
       </w:r>
       <w:r>
         <w:t xml:space="preserve"> Sur le compteur de congés du bulletin de paie, une fois les jours hors période pris.</w:t>
+      </w:r>
+    </w:p>
+    <w:p>
+      <w:pPr/>
+      <w:r>
+        <w:rPr>
+          <w:b/>
+        </w:rPr>
+        <w:t xml:space="preserve">Peut-on prendre plus de 12 jours du congé principal après le 31 octobre ?</w:t>
+      </w:r>
+      <w:r>
+        <w:t xml:space="preserve"> Non. Les 12 jours ouvrables consécutifs minimum doivent être pris entre le 1er mai et le 31 octobre. Au-delà de 12 jours du congé principal hors période, seule la 5e semaine peut être prise en plus (cas E : 18 jours pris à partir de novembre, dont 6 de 5e semaine).</w:t>
+      </w:r>
+    </w:p>
+    <w:p>
+      <w:pPr/>
+      <w:r>
+        <w:rPr>
+          <w:b/>
+        </w:rPr>
+        <w:t xml:space="preserve">1 semaine hors période donne-t-elle toujours 2 jours, 2 semaines 3 jours ?</w:t>
+      </w:r>
+      <w:r>
+        <w:t xml:space="preserve"> Seulement si l'employeur impose la prise hors période : la convention collective donne alors 2 jours pour la 1re semaine, puis 1 jour par semaine suivante (cas G). Quand la demande vient du salarié, le barème du tableau s'applique : 3 à 5 jours = 1 jour, 6 jours ou plus = 2 jours, maximum 2.</w:t>
       </w:r>
     </w:p>
     <w:p>

</xml_diff>

<commit_message>
Insiste sur les 12 jours consécutifs à poser dans la période légale
Co-Authored-By: Claude Sonnet 5.5 <noreply@anthropic.com>
Claude-Session: https://claude.ai/code/session_01HJAh9TQga6fZztnqnhABbG
</commit_message>
<xml_diff>
--- a/Circulaire_les_jours_de_conges_de_fractionnement.docx
+++ b/Circulaire_les_jours_de_conges_de_fractionnement.docx
@@ -310,6 +310,26 @@
         <w:t xml:space="preserve">Les jours de fractionnement sont accordés pour les jours du congé principal pris en dehors de la période légale, c'est-à-dire à partir du 1er novembre (Code du travail, article L3141-23).</w:t>
       </w:r>
     </w:p>
+    <w:p>
+      <w:pPr>
+        <w:pBdr>
+          <w:top w:val="single" w:sz="12" w:space="4" w:color="DC2626"/>
+          <w:left w:val="single" w:sz="12" w:space="4" w:color="DC2626"/>
+          <w:bottom w:val="single" w:sz="12" w:space="4" w:color="DC2626"/>
+          <w:right w:val="single" w:sz="12" w:space="4" w:color="DC2626"/>
+        </w:pBdr>
+        <w:shd w:val="clear" w:color="auto" w:fill="FEE2E2"/>
+      </w:pPr>
+      <w:r>
+        <w:rPr>
+          <w:b/>
+        </w:rPr>
+        <w:t xml:space="preserve">À faire avant tout : poser 12 jours ouvrables consécutifs du congé principal entre le 1er mai et le 31 octobre.</w:t>
+      </w:r>
+      <w:r>
+        <w:t xml:space="preserve"> Les jours pris hors période (par exemple 5 jours imposés à Noël) n'ont pas à être consécutifs : le salarié y a droit aux jours de fractionnement dès que les critères ci-dessous sont remplis.</w:t>
+      </w:r>
+    </w:p>
     <w:tbl>
       <w:tblPr>
         <w:tblStyle w:val="TableGrid"/>
@@ -1629,7 +1649,7 @@
         </w:numPr>
       </w:pPr>
       <w:r>
-        <w:t xml:space="preserve">Vérifier qu'au moins 12 jours ouvrables consécutifs sont posés entre le 1er mai et le 31 octobre.</w:t>
+        <w:t xml:space="preserve">Obligatoire : poser au moins 12 jours ouvrables consécutifs entre le 1er mai et le 31 octobre, avant de poser ou d'imposer des jours hors période.</w:t>
       </w:r>
     </w:p>
     <w:p>
@@ -1681,7 +1701,7 @@
       <w:r>
         <w:drawing>
           <wp:inline distT="0" distB="0" distL="0" distR="0">
-            <wp:extent cx="5486400" cy="3314700"/>
+            <wp:extent cx="5486400" cy="3804557"/>
             <wp:docPr id="4" name="image4" descr="Schéma de synthèse : les jours de fractionnement en un coup d'œil"/>
             <a:graphic xmlns:a="http://schemas.openxmlformats.org/drawingml/2006/main">
               <a:graphicData uri="http://schemas.openxmlformats.org/drawingml/2006/picture">
@@ -1699,7 +1719,7 @@
                   <pic:spPr>
                     <a:xfrm>
                       <a:off x="0" y="0"/>
-                      <a:ext cx="5486400" cy="3314700"/>
+                      <a:ext cx="5486400" cy="3804557"/>
                     </a:xfrm>
                     <a:prstGeom prst="rect"/>
                   </pic:spPr>

</xml_diff>